<commit_message>
Switch Malawi to IHS cross-sections; add Tanzania ASC; refresh report
</commit_message>
<xml_diff>
--- a/Output/Tables/tenure_share_tables.docx
+++ b/Output/Tables/tenure_share_tables.docx
@@ -109,7 +109,7 @@
               <w:rPr>
                 <w:b/>
               </w:rPr>
-              <w:t>Ethiopia</w:t>
+              <w:t>Ethiopia (LSMS)</w:t>
             </w:r>
           </w:p>
         </w:tc>
@@ -414,7 +414,7 @@
               <w:rPr>
                 <w:b/>
               </w:rPr>
-              <w:t>Malawi</w:t>
+              <w:t>Malawi (LSMS)</w:t>
             </w:r>
           </w:p>
         </w:tc>
@@ -434,27 +434,27 @@
           </w:tcPr>
           <w:p>
             <w:r>
-              <w:t>0.121</w:t>
-            </w:r>
-          </w:p>
-        </w:tc>
-        <w:tc>
-          <w:tcPr>
-            <w:tcW w:type="dxa" w:w="1440"/>
-          </w:tcPr>
-          <w:p>
-            <w:r>
-              <w:t>0.004</w:t>
-            </w:r>
-          </w:p>
-        </w:tc>
-        <w:tc>
-          <w:tcPr>
-            <w:tcW w:type="dxa" w:w="1440"/>
-          </w:tcPr>
-          <w:p>
-            <w:r>
-              <w:t>0.039</w:t>
+              <w:t>0.101</w:t>
+            </w:r>
+          </w:p>
+        </w:tc>
+        <w:tc>
+          <w:tcPr>
+            <w:tcW w:type="dxa" w:w="1440"/>
+          </w:tcPr>
+          <w:p>
+            <w:r>
+              <w:t>0.001</w:t>
+            </w:r>
+          </w:p>
+        </w:tc>
+        <w:tc>
+          <w:tcPr>
+            <w:tcW w:type="dxa" w:w="1440"/>
+          </w:tcPr>
+          <w:p>
+            <w:r>
+              <w:t>0.032</w:t>
             </w:r>
           </w:p>
         </w:tc>
@@ -484,47 +484,47 @@
           </w:tcPr>
           <w:p>
             <w:r>
-              <w:t>2013</w:t>
-            </w:r>
-          </w:p>
-        </w:tc>
-        <w:tc>
-          <w:tcPr>
-            <w:tcW w:type="dxa" w:w="1440"/>
-          </w:tcPr>
-          <w:p>
-            <w:r>
-              <w:t>0.117</w:t>
-            </w:r>
-          </w:p>
-        </w:tc>
-        <w:tc>
-          <w:tcPr>
-            <w:tcW w:type="dxa" w:w="1440"/>
-          </w:tcPr>
-          <w:p>
-            <w:r>
-              <w:t>0.006</w:t>
-            </w:r>
-          </w:p>
-        </w:tc>
-        <w:tc>
-          <w:tcPr>
-            <w:tcW w:type="dxa" w:w="1440"/>
-          </w:tcPr>
-          <w:p>
-            <w:r>
-              <w:t>0.031</w:t>
-            </w:r>
-          </w:p>
-        </w:tc>
-        <w:tc>
-          <w:tcPr>
-            <w:tcW w:type="dxa" w:w="1440"/>
-          </w:tcPr>
-          <w:p>
-            <w:r>
-              <w:t>0.026</w:t>
+              <w:t>2016</w:t>
+            </w:r>
+          </w:p>
+        </w:tc>
+        <w:tc>
+          <w:tcPr>
+            <w:tcW w:type="dxa" w:w="1440"/>
+          </w:tcPr>
+          <w:p>
+            <w:r>
+              <w:t>0.096</w:t>
+            </w:r>
+          </w:p>
+        </w:tc>
+        <w:tc>
+          <w:tcPr>
+            <w:tcW w:type="dxa" w:w="1440"/>
+          </w:tcPr>
+          <w:p>
+            <w:r>
+              <w:t>0.013</w:t>
+            </w:r>
+          </w:p>
+        </w:tc>
+        <w:tc>
+          <w:tcPr>
+            <w:tcW w:type="dxa" w:w="1440"/>
+          </w:tcPr>
+          <w:p>
+            <w:r>
+              <w:t>0.043</w:t>
+            </w:r>
+          </w:p>
+        </w:tc>
+        <w:tc>
+          <w:tcPr>
+            <w:tcW w:type="dxa" w:w="1440"/>
+          </w:tcPr>
+          <w:p>
+            <w:r>
+              <w:t>0.011</w:t>
             </w:r>
           </w:p>
         </w:tc>
@@ -544,66 +544,6 @@
           </w:tcPr>
           <w:p>
             <w:r>
-              <w:t>2016</w:t>
-            </w:r>
-          </w:p>
-        </w:tc>
-        <w:tc>
-          <w:tcPr>
-            <w:tcW w:type="dxa" w:w="1440"/>
-          </w:tcPr>
-          <w:p>
-            <w:r>
-              <w:t>0.119</w:t>
-            </w:r>
-          </w:p>
-        </w:tc>
-        <w:tc>
-          <w:tcPr>
-            <w:tcW w:type="dxa" w:w="1440"/>
-          </w:tcPr>
-          <w:p>
-            <w:r>
-              <w:t>0.024</w:t>
-            </w:r>
-          </w:p>
-        </w:tc>
-        <w:tc>
-          <w:tcPr>
-            <w:tcW w:type="dxa" w:w="1440"/>
-          </w:tcPr>
-          <w:p>
-            <w:r>
-              <w:t>0.065</w:t>
-            </w:r>
-          </w:p>
-        </w:tc>
-        <w:tc>
-          <w:tcPr>
-            <w:tcW w:type="dxa" w:w="1440"/>
-          </w:tcPr>
-          <w:p>
-            <w:r>
-              <w:t>0.019</w:t>
-            </w:r>
-          </w:p>
-        </w:tc>
-      </w:tr>
-      <w:tr>
-        <w:tc>
-          <w:tcPr>
-            <w:tcW w:type="dxa" w:w="1440"/>
-          </w:tcPr>
-          <w:p>
-            <w:r/>
-          </w:p>
-        </w:tc>
-        <w:tc>
-          <w:tcPr>
-            <w:tcW w:type="dxa" w:w="1440"/>
-          </w:tcPr>
-          <w:p>
-            <w:r>
               <w:t>2019</w:t>
             </w:r>
           </w:p>
@@ -614,17 +554,17 @@
           </w:tcPr>
           <w:p>
             <w:r>
-              <w:t>0.109</w:t>
-            </w:r>
-          </w:p>
-        </w:tc>
-        <w:tc>
-          <w:tcPr>
-            <w:tcW w:type="dxa" w:w="1440"/>
-          </w:tcPr>
-          <w:p>
-            <w:r>
-              <w:t>0.023</w:t>
+              <w:t>0.100</w:t>
+            </w:r>
+          </w:p>
+        </w:tc>
+        <w:tc>
+          <w:tcPr>
+            <w:tcW w:type="dxa" w:w="1440"/>
+          </w:tcPr>
+          <w:p>
+            <w:r>
+              <w:t>0.010</w:t>
             </w:r>
           </w:p>
         </w:tc>
@@ -659,7 +599,7 @@
               <w:rPr>
                 <w:b/>
               </w:rPr>
-              <w:t>Mali</w:t>
+              <w:t>Mali (LSMS)</w:t>
             </w:r>
           </w:p>
         </w:tc>
@@ -784,7 +724,7 @@
               <w:rPr>
                 <w:b/>
               </w:rPr>
-              <w:t>Niger</w:t>
+              <w:t>Niger (LSMS)</w:t>
             </w:r>
           </w:p>
         </w:tc>
@@ -909,7 +849,7 @@
               <w:rPr>
                 <w:b/>
               </w:rPr>
-              <w:t>Nigeria</w:t>
+              <w:t>Nigeria (LSMS)</w:t>
             </w:r>
           </w:p>
         </w:tc>
@@ -1214,7 +1154,7 @@
               <w:rPr>
                 <w:b/>
               </w:rPr>
-              <w:t>Tanzania</w:t>
+              <w:t>Tanzania (LSMS)</w:t>
             </w:r>
           </w:p>
         </w:tc>
@@ -1519,7 +1459,7 @@
               <w:rPr>
                 <w:b/>
               </w:rPr>
-              <w:t>Uganda</w:t>
+              <w:t>Tanzania (ASC)</w:t>
             </w:r>
           </w:p>
         </w:tc>
@@ -1539,37 +1479,37 @@
           </w:tcPr>
           <w:p>
             <w:r>
-              <w:t>0.214</w:t>
-            </w:r>
-          </w:p>
-        </w:tc>
-        <w:tc>
-          <w:tcPr>
-            <w:tcW w:type="dxa" w:w="1440"/>
-          </w:tcPr>
-          <w:p>
-            <w:r>
-              <w:t>0.030</w:t>
-            </w:r>
-          </w:p>
-        </w:tc>
-        <w:tc>
-          <w:tcPr>
-            <w:tcW w:type="dxa" w:w="1440"/>
-          </w:tcPr>
-          <w:p>
-            <w:r>
-              <w:t>0.379</w:t>
-            </w:r>
-          </w:p>
-        </w:tc>
-        <w:tc>
-          <w:tcPr>
-            <w:tcW w:type="dxa" w:w="1440"/>
-          </w:tcPr>
-          <w:p>
-            <w:r>
-              <w:t>0.226</w:t>
+              <w:t>0.108</w:t>
+            </w:r>
+          </w:p>
+        </w:tc>
+        <w:tc>
+          <w:tcPr>
+            <w:tcW w:type="dxa" w:w="1440"/>
+          </w:tcPr>
+          <w:p>
+            <w:r>
+              <w:t>0.028</w:t>
+            </w:r>
+          </w:p>
+        </w:tc>
+        <w:tc>
+          <w:tcPr>
+            <w:tcW w:type="dxa" w:w="1440"/>
+          </w:tcPr>
+          <w:p>
+            <w:r>
+              <w:t>0.195</w:t>
+            </w:r>
+          </w:p>
+        </w:tc>
+        <w:tc>
+          <w:tcPr>
+            <w:tcW w:type="dxa" w:w="1440"/>
+          </w:tcPr>
+          <w:p>
+            <w:r>
+              <w:t>0.061</w:t>
             </w:r>
           </w:p>
         </w:tc>
@@ -1589,306 +1529,6 @@
           </w:tcPr>
           <w:p>
             <w:r>
-              <w:t>2010</w:t>
-            </w:r>
-          </w:p>
-        </w:tc>
-        <w:tc>
-          <w:tcPr>
-            <w:tcW w:type="dxa" w:w="1440"/>
-          </w:tcPr>
-          <w:p>
-            <w:r>
-              <w:t>0.202</w:t>
-            </w:r>
-          </w:p>
-        </w:tc>
-        <w:tc>
-          <w:tcPr>
-            <w:tcW w:type="dxa" w:w="1440"/>
-          </w:tcPr>
-          <w:p>
-            <w:r>
-              <w:t>0.004</w:t>
-            </w:r>
-          </w:p>
-        </w:tc>
-        <w:tc>
-          <w:tcPr>
-            <w:tcW w:type="dxa" w:w="1440"/>
-          </w:tcPr>
-          <w:p>
-            <w:r>
-              <w:t>0.350</w:t>
-            </w:r>
-          </w:p>
-        </w:tc>
-        <w:tc>
-          <w:tcPr>
-            <w:tcW w:type="dxa" w:w="1440"/>
-          </w:tcPr>
-          <w:p>
-            <w:r>
-              <w:t>0.168</w:t>
-            </w:r>
-          </w:p>
-        </w:tc>
-      </w:tr>
-      <w:tr>
-        <w:tc>
-          <w:tcPr>
-            <w:tcW w:type="dxa" w:w="1440"/>
-          </w:tcPr>
-          <w:p>
-            <w:r/>
-          </w:p>
-        </w:tc>
-        <w:tc>
-          <w:tcPr>
-            <w:tcW w:type="dxa" w:w="1440"/>
-          </w:tcPr>
-          <w:p>
-            <w:r>
-              <w:t>2011</w:t>
-            </w:r>
-          </w:p>
-        </w:tc>
-        <w:tc>
-          <w:tcPr>
-            <w:tcW w:type="dxa" w:w="1440"/>
-          </w:tcPr>
-          <w:p>
-            <w:r>
-              <w:t>0.136</w:t>
-            </w:r>
-          </w:p>
-        </w:tc>
-        <w:tc>
-          <w:tcPr>
-            <w:tcW w:type="dxa" w:w="1440"/>
-          </w:tcPr>
-          <w:p>
-            <w:r>
-              <w:t>0.012</w:t>
-            </w:r>
-          </w:p>
-        </w:tc>
-        <w:tc>
-          <w:tcPr>
-            <w:tcW w:type="dxa" w:w="1440"/>
-          </w:tcPr>
-          <w:p>
-            <w:r>
-              <w:t>0.298</w:t>
-            </w:r>
-          </w:p>
-        </w:tc>
-        <w:tc>
-          <w:tcPr>
-            <w:tcW w:type="dxa" w:w="1440"/>
-          </w:tcPr>
-          <w:p>
-            <w:r>
-              <w:t>0.159</w:t>
-            </w:r>
-          </w:p>
-        </w:tc>
-      </w:tr>
-      <w:tr>
-        <w:tc>
-          <w:tcPr>
-            <w:tcW w:type="dxa" w:w="1440"/>
-          </w:tcPr>
-          <w:p>
-            <w:r/>
-          </w:p>
-        </w:tc>
-        <w:tc>
-          <w:tcPr>
-            <w:tcW w:type="dxa" w:w="1440"/>
-          </w:tcPr>
-          <w:p>
-            <w:r>
-              <w:t>2013</w:t>
-            </w:r>
-          </w:p>
-        </w:tc>
-        <w:tc>
-          <w:tcPr>
-            <w:tcW w:type="dxa" w:w="1440"/>
-          </w:tcPr>
-          <w:p>
-            <w:r>
-              <w:t>0.172</w:t>
-            </w:r>
-          </w:p>
-        </w:tc>
-        <w:tc>
-          <w:tcPr>
-            <w:tcW w:type="dxa" w:w="1440"/>
-          </w:tcPr>
-          <w:p>
-            <w:r>
-              <w:t>0.011</w:t>
-            </w:r>
-          </w:p>
-        </w:tc>
-        <w:tc>
-          <w:tcPr>
-            <w:tcW w:type="dxa" w:w="1440"/>
-          </w:tcPr>
-          <w:p>
-            <w:r>
-              <w:t>0.352</w:t>
-            </w:r>
-          </w:p>
-        </w:tc>
-        <w:tc>
-          <w:tcPr>
-            <w:tcW w:type="dxa" w:w="1440"/>
-          </w:tcPr>
-          <w:p>
-            <w:r>
-              <w:t>0.256</w:t>
-            </w:r>
-          </w:p>
-        </w:tc>
-      </w:tr>
-      <w:tr>
-        <w:tc>
-          <w:tcPr>
-            <w:tcW w:type="dxa" w:w="1440"/>
-          </w:tcPr>
-          <w:p>
-            <w:r/>
-          </w:p>
-        </w:tc>
-        <w:tc>
-          <w:tcPr>
-            <w:tcW w:type="dxa" w:w="1440"/>
-          </w:tcPr>
-          <w:p>
-            <w:r>
-              <w:t>2015</w:t>
-            </w:r>
-          </w:p>
-        </w:tc>
-        <w:tc>
-          <w:tcPr>
-            <w:tcW w:type="dxa" w:w="1440"/>
-          </w:tcPr>
-          <w:p>
-            <w:r>
-              <w:t>0.232</w:t>
-            </w:r>
-          </w:p>
-        </w:tc>
-        <w:tc>
-          <w:tcPr>
-            <w:tcW w:type="dxa" w:w="1440"/>
-          </w:tcPr>
-          <w:p>
-            <w:r>
-              <w:t>0.019</w:t>
-            </w:r>
-          </w:p>
-        </w:tc>
-        <w:tc>
-          <w:tcPr>
-            <w:tcW w:type="dxa" w:w="1440"/>
-          </w:tcPr>
-          <w:p>
-            <w:r>
-              <w:t>0.366</w:t>
-            </w:r>
-          </w:p>
-        </w:tc>
-        <w:tc>
-          <w:tcPr>
-            <w:tcW w:type="dxa" w:w="1440"/>
-          </w:tcPr>
-          <w:p>
-            <w:r>
-              <w:t>0.218</w:t>
-            </w:r>
-          </w:p>
-        </w:tc>
-      </w:tr>
-      <w:tr>
-        <w:tc>
-          <w:tcPr>
-            <w:tcW w:type="dxa" w:w="1440"/>
-          </w:tcPr>
-          <w:p>
-            <w:r/>
-          </w:p>
-        </w:tc>
-        <w:tc>
-          <w:tcPr>
-            <w:tcW w:type="dxa" w:w="1440"/>
-          </w:tcPr>
-          <w:p>
-            <w:r>
-              <w:t>2018</w:t>
-            </w:r>
-          </w:p>
-        </w:tc>
-        <w:tc>
-          <w:tcPr>
-            <w:tcW w:type="dxa" w:w="1440"/>
-          </w:tcPr>
-          <w:p>
-            <w:r>
-              <w:t>0.210</w:t>
-            </w:r>
-          </w:p>
-        </w:tc>
-        <w:tc>
-          <w:tcPr>
-            <w:tcW w:type="dxa" w:w="1440"/>
-          </w:tcPr>
-          <w:p>
-            <w:r>
-              <w:t>0.023</w:t>
-            </w:r>
-          </w:p>
-        </w:tc>
-        <w:tc>
-          <w:tcPr>
-            <w:tcW w:type="dxa" w:w="1440"/>
-          </w:tcPr>
-          <w:p>
-            <w:r>
-              <w:t>-</w:t>
-            </w:r>
-          </w:p>
-        </w:tc>
-        <w:tc>
-          <w:tcPr>
-            <w:tcW w:type="dxa" w:w="1440"/>
-          </w:tcPr>
-          <w:p>
-            <w:r>
-              <w:t>0.127</w:t>
-            </w:r>
-          </w:p>
-        </w:tc>
-      </w:tr>
-      <w:tr>
-        <w:tc>
-          <w:tcPr>
-            <w:tcW w:type="dxa" w:w="1440"/>
-          </w:tcPr>
-          <w:p>
-            <w:r/>
-          </w:p>
-        </w:tc>
-        <w:tc>
-          <w:tcPr>
-            <w:tcW w:type="dxa" w:w="1440"/>
-          </w:tcPr>
-          <w:p>
-            <w:r>
               <w:t>2019</w:t>
             </w:r>
           </w:p>
@@ -1899,37 +1539,37 @@
           </w:tcPr>
           <w:p>
             <w:r>
-              <w:t>0.188</w:t>
-            </w:r>
-          </w:p>
-        </w:tc>
-        <w:tc>
-          <w:tcPr>
-            <w:tcW w:type="dxa" w:w="1440"/>
-          </w:tcPr>
-          <w:p>
-            <w:r>
-              <w:t>0.024</w:t>
-            </w:r>
-          </w:p>
-        </w:tc>
-        <w:tc>
-          <w:tcPr>
-            <w:tcW w:type="dxa" w:w="1440"/>
-          </w:tcPr>
-          <w:p>
-            <w:r>
-              <w:t>0.346</w:t>
-            </w:r>
-          </w:p>
-        </w:tc>
-        <w:tc>
-          <w:tcPr>
-            <w:tcW w:type="dxa" w:w="1440"/>
-          </w:tcPr>
-          <w:p>
-            <w:r>
-              <w:t>0.075</w:t>
+              <w:t>0.201</w:t>
+            </w:r>
+          </w:p>
+        </w:tc>
+        <w:tc>
+          <w:tcPr>
+            <w:tcW w:type="dxa" w:w="1440"/>
+          </w:tcPr>
+          <w:p>
+            <w:r>
+              <w:t>0.029</w:t>
+            </w:r>
+          </w:p>
+        </w:tc>
+        <w:tc>
+          <w:tcPr>
+            <w:tcW w:type="dxa" w:w="1440"/>
+          </w:tcPr>
+          <w:p>
+            <w:r>
+              <w:t>0.077</w:t>
+            </w:r>
+          </w:p>
+        </w:tc>
+        <w:tc>
+          <w:tcPr>
+            <w:tcW w:type="dxa" w:w="1440"/>
+          </w:tcPr>
+          <w:p>
+            <w:r>
+              <w:t>0.077</w:t>
             </w:r>
           </w:p>
         </w:tc>
@@ -1944,7 +1584,432 @@
               <w:rPr>
                 <w:b/>
               </w:rPr>
-              <w:t>Zambia</w:t>
+              <w:t>Uganda (LSMS)</w:t>
+            </w:r>
+          </w:p>
+        </w:tc>
+        <w:tc>
+          <w:tcPr>
+            <w:tcW w:type="dxa" w:w="1440"/>
+          </w:tcPr>
+          <w:p>
+            <w:r>
+              <w:t>2009</w:t>
+            </w:r>
+          </w:p>
+        </w:tc>
+        <w:tc>
+          <w:tcPr>
+            <w:tcW w:type="dxa" w:w="1440"/>
+          </w:tcPr>
+          <w:p>
+            <w:r>
+              <w:t>0.214</w:t>
+            </w:r>
+          </w:p>
+        </w:tc>
+        <w:tc>
+          <w:tcPr>
+            <w:tcW w:type="dxa" w:w="1440"/>
+          </w:tcPr>
+          <w:p>
+            <w:r>
+              <w:t>0.030</w:t>
+            </w:r>
+          </w:p>
+        </w:tc>
+        <w:tc>
+          <w:tcPr>
+            <w:tcW w:type="dxa" w:w="1440"/>
+          </w:tcPr>
+          <w:p>
+            <w:r>
+              <w:t>0.379</w:t>
+            </w:r>
+          </w:p>
+        </w:tc>
+        <w:tc>
+          <w:tcPr>
+            <w:tcW w:type="dxa" w:w="1440"/>
+          </w:tcPr>
+          <w:p>
+            <w:r>
+              <w:t>0.226</w:t>
+            </w:r>
+          </w:p>
+        </w:tc>
+      </w:tr>
+      <w:tr>
+        <w:tc>
+          <w:tcPr>
+            <w:tcW w:type="dxa" w:w="1440"/>
+          </w:tcPr>
+          <w:p>
+            <w:r/>
+          </w:p>
+        </w:tc>
+        <w:tc>
+          <w:tcPr>
+            <w:tcW w:type="dxa" w:w="1440"/>
+          </w:tcPr>
+          <w:p>
+            <w:r>
+              <w:t>2010</w:t>
+            </w:r>
+          </w:p>
+        </w:tc>
+        <w:tc>
+          <w:tcPr>
+            <w:tcW w:type="dxa" w:w="1440"/>
+          </w:tcPr>
+          <w:p>
+            <w:r>
+              <w:t>0.202</w:t>
+            </w:r>
+          </w:p>
+        </w:tc>
+        <w:tc>
+          <w:tcPr>
+            <w:tcW w:type="dxa" w:w="1440"/>
+          </w:tcPr>
+          <w:p>
+            <w:r>
+              <w:t>0.004</w:t>
+            </w:r>
+          </w:p>
+        </w:tc>
+        <w:tc>
+          <w:tcPr>
+            <w:tcW w:type="dxa" w:w="1440"/>
+          </w:tcPr>
+          <w:p>
+            <w:r>
+              <w:t>0.350</w:t>
+            </w:r>
+          </w:p>
+        </w:tc>
+        <w:tc>
+          <w:tcPr>
+            <w:tcW w:type="dxa" w:w="1440"/>
+          </w:tcPr>
+          <w:p>
+            <w:r>
+              <w:t>0.168</w:t>
+            </w:r>
+          </w:p>
+        </w:tc>
+      </w:tr>
+      <w:tr>
+        <w:tc>
+          <w:tcPr>
+            <w:tcW w:type="dxa" w:w="1440"/>
+          </w:tcPr>
+          <w:p>
+            <w:r/>
+          </w:p>
+        </w:tc>
+        <w:tc>
+          <w:tcPr>
+            <w:tcW w:type="dxa" w:w="1440"/>
+          </w:tcPr>
+          <w:p>
+            <w:r>
+              <w:t>2011</w:t>
+            </w:r>
+          </w:p>
+        </w:tc>
+        <w:tc>
+          <w:tcPr>
+            <w:tcW w:type="dxa" w:w="1440"/>
+          </w:tcPr>
+          <w:p>
+            <w:r>
+              <w:t>0.136</w:t>
+            </w:r>
+          </w:p>
+        </w:tc>
+        <w:tc>
+          <w:tcPr>
+            <w:tcW w:type="dxa" w:w="1440"/>
+          </w:tcPr>
+          <w:p>
+            <w:r>
+              <w:t>0.012</w:t>
+            </w:r>
+          </w:p>
+        </w:tc>
+        <w:tc>
+          <w:tcPr>
+            <w:tcW w:type="dxa" w:w="1440"/>
+          </w:tcPr>
+          <w:p>
+            <w:r>
+              <w:t>0.298</w:t>
+            </w:r>
+          </w:p>
+        </w:tc>
+        <w:tc>
+          <w:tcPr>
+            <w:tcW w:type="dxa" w:w="1440"/>
+          </w:tcPr>
+          <w:p>
+            <w:r>
+              <w:t>0.159</w:t>
+            </w:r>
+          </w:p>
+        </w:tc>
+      </w:tr>
+      <w:tr>
+        <w:tc>
+          <w:tcPr>
+            <w:tcW w:type="dxa" w:w="1440"/>
+          </w:tcPr>
+          <w:p>
+            <w:r/>
+          </w:p>
+        </w:tc>
+        <w:tc>
+          <w:tcPr>
+            <w:tcW w:type="dxa" w:w="1440"/>
+          </w:tcPr>
+          <w:p>
+            <w:r>
+              <w:t>2013</w:t>
+            </w:r>
+          </w:p>
+        </w:tc>
+        <w:tc>
+          <w:tcPr>
+            <w:tcW w:type="dxa" w:w="1440"/>
+          </w:tcPr>
+          <w:p>
+            <w:r>
+              <w:t>0.172</w:t>
+            </w:r>
+          </w:p>
+        </w:tc>
+        <w:tc>
+          <w:tcPr>
+            <w:tcW w:type="dxa" w:w="1440"/>
+          </w:tcPr>
+          <w:p>
+            <w:r>
+              <w:t>0.011</w:t>
+            </w:r>
+          </w:p>
+        </w:tc>
+        <w:tc>
+          <w:tcPr>
+            <w:tcW w:type="dxa" w:w="1440"/>
+          </w:tcPr>
+          <w:p>
+            <w:r>
+              <w:t>0.352</w:t>
+            </w:r>
+          </w:p>
+        </w:tc>
+        <w:tc>
+          <w:tcPr>
+            <w:tcW w:type="dxa" w:w="1440"/>
+          </w:tcPr>
+          <w:p>
+            <w:r>
+              <w:t>0.256</w:t>
+            </w:r>
+          </w:p>
+        </w:tc>
+      </w:tr>
+      <w:tr>
+        <w:tc>
+          <w:tcPr>
+            <w:tcW w:type="dxa" w:w="1440"/>
+          </w:tcPr>
+          <w:p>
+            <w:r/>
+          </w:p>
+        </w:tc>
+        <w:tc>
+          <w:tcPr>
+            <w:tcW w:type="dxa" w:w="1440"/>
+          </w:tcPr>
+          <w:p>
+            <w:r>
+              <w:t>2015</w:t>
+            </w:r>
+          </w:p>
+        </w:tc>
+        <w:tc>
+          <w:tcPr>
+            <w:tcW w:type="dxa" w:w="1440"/>
+          </w:tcPr>
+          <w:p>
+            <w:r>
+              <w:t>0.232</w:t>
+            </w:r>
+          </w:p>
+        </w:tc>
+        <w:tc>
+          <w:tcPr>
+            <w:tcW w:type="dxa" w:w="1440"/>
+          </w:tcPr>
+          <w:p>
+            <w:r>
+              <w:t>0.019</w:t>
+            </w:r>
+          </w:p>
+        </w:tc>
+        <w:tc>
+          <w:tcPr>
+            <w:tcW w:type="dxa" w:w="1440"/>
+          </w:tcPr>
+          <w:p>
+            <w:r>
+              <w:t>0.366</w:t>
+            </w:r>
+          </w:p>
+        </w:tc>
+        <w:tc>
+          <w:tcPr>
+            <w:tcW w:type="dxa" w:w="1440"/>
+          </w:tcPr>
+          <w:p>
+            <w:r>
+              <w:t>0.218</w:t>
+            </w:r>
+          </w:p>
+        </w:tc>
+      </w:tr>
+      <w:tr>
+        <w:tc>
+          <w:tcPr>
+            <w:tcW w:type="dxa" w:w="1440"/>
+          </w:tcPr>
+          <w:p>
+            <w:r/>
+          </w:p>
+        </w:tc>
+        <w:tc>
+          <w:tcPr>
+            <w:tcW w:type="dxa" w:w="1440"/>
+          </w:tcPr>
+          <w:p>
+            <w:r>
+              <w:t>2018</w:t>
+            </w:r>
+          </w:p>
+        </w:tc>
+        <w:tc>
+          <w:tcPr>
+            <w:tcW w:type="dxa" w:w="1440"/>
+          </w:tcPr>
+          <w:p>
+            <w:r>
+              <w:t>0.210</w:t>
+            </w:r>
+          </w:p>
+        </w:tc>
+        <w:tc>
+          <w:tcPr>
+            <w:tcW w:type="dxa" w:w="1440"/>
+          </w:tcPr>
+          <w:p>
+            <w:r>
+              <w:t>0.023</w:t>
+            </w:r>
+          </w:p>
+        </w:tc>
+        <w:tc>
+          <w:tcPr>
+            <w:tcW w:type="dxa" w:w="1440"/>
+          </w:tcPr>
+          <w:p>
+            <w:r>
+              <w:t>-</w:t>
+            </w:r>
+          </w:p>
+        </w:tc>
+        <w:tc>
+          <w:tcPr>
+            <w:tcW w:type="dxa" w:w="1440"/>
+          </w:tcPr>
+          <w:p>
+            <w:r>
+              <w:t>0.127</w:t>
+            </w:r>
+          </w:p>
+        </w:tc>
+      </w:tr>
+      <w:tr>
+        <w:tc>
+          <w:tcPr>
+            <w:tcW w:type="dxa" w:w="1440"/>
+          </w:tcPr>
+          <w:p>
+            <w:r/>
+          </w:p>
+        </w:tc>
+        <w:tc>
+          <w:tcPr>
+            <w:tcW w:type="dxa" w:w="1440"/>
+          </w:tcPr>
+          <w:p>
+            <w:r>
+              <w:t>2019</w:t>
+            </w:r>
+          </w:p>
+        </w:tc>
+        <w:tc>
+          <w:tcPr>
+            <w:tcW w:type="dxa" w:w="1440"/>
+          </w:tcPr>
+          <w:p>
+            <w:r>
+              <w:t>0.188</w:t>
+            </w:r>
+          </w:p>
+        </w:tc>
+        <w:tc>
+          <w:tcPr>
+            <w:tcW w:type="dxa" w:w="1440"/>
+          </w:tcPr>
+          <w:p>
+            <w:r>
+              <w:t>0.024</w:t>
+            </w:r>
+          </w:p>
+        </w:tc>
+        <w:tc>
+          <w:tcPr>
+            <w:tcW w:type="dxa" w:w="1440"/>
+          </w:tcPr>
+          <w:p>
+            <w:r>
+              <w:t>0.346</w:t>
+            </w:r>
+          </w:p>
+        </w:tc>
+        <w:tc>
+          <w:tcPr>
+            <w:tcW w:type="dxa" w:w="1440"/>
+          </w:tcPr>
+          <w:p>
+            <w:r>
+              <w:t>0.075</w:t>
+            </w:r>
+          </w:p>
+        </w:tc>
+      </w:tr>
+      <w:tr>
+        <w:tc>
+          <w:tcPr>
+            <w:tcW w:type="dxa" w:w="1440"/>
+          </w:tcPr>
+          <w:p>
+            <w:r>
+              <w:rPr>
+                <w:b/>
+              </w:rPr>
+              <w:t>Zambia (RALS)</w:t>
             </w:r>
           </w:p>
         </w:tc>
@@ -2214,7 +2279,7 @@
               <w:rPr>
                 <w:b/>
               </w:rPr>
-              <w:t>Ethiopia</w:t>
+              <w:t>Ethiopia (LSMS)</w:t>
             </w:r>
           </w:p>
         </w:tc>
@@ -2519,7 +2584,7 @@
               <w:rPr>
                 <w:b/>
               </w:rPr>
-              <w:t>Malawi</w:t>
+              <w:t>Malawi (LSMS)</w:t>
             </w:r>
           </w:p>
         </w:tc>
@@ -2539,27 +2604,27 @@
           </w:tcPr>
           <w:p>
             <w:r>
-              <w:t>0.082</w:t>
-            </w:r>
-          </w:p>
-        </w:tc>
-        <w:tc>
-          <w:tcPr>
-            <w:tcW w:type="dxa" w:w="1440"/>
-          </w:tcPr>
-          <w:p>
-            <w:r>
-              <w:t>0.002</w:t>
-            </w:r>
-          </w:p>
-        </w:tc>
-        <w:tc>
-          <w:tcPr>
-            <w:tcW w:type="dxa" w:w="1440"/>
-          </w:tcPr>
-          <w:p>
-            <w:r>
-              <w:t>0.031</w:t>
+              <w:t>0.073</w:t>
+            </w:r>
+          </w:p>
+        </w:tc>
+        <w:tc>
+          <w:tcPr>
+            <w:tcW w:type="dxa" w:w="1440"/>
+          </w:tcPr>
+          <w:p>
+            <w:r>
+              <w:t>0.001</w:t>
+            </w:r>
+          </w:p>
+        </w:tc>
+        <w:tc>
+          <w:tcPr>
+            <w:tcW w:type="dxa" w:w="1440"/>
+          </w:tcPr>
+          <w:p>
+            <w:r>
+              <w:t>0.028</w:t>
             </w:r>
           </w:p>
         </w:tc>
@@ -2589,47 +2654,47 @@
           </w:tcPr>
           <w:p>
             <w:r>
-              <w:t>2013</w:t>
-            </w:r>
-          </w:p>
-        </w:tc>
-        <w:tc>
-          <w:tcPr>
-            <w:tcW w:type="dxa" w:w="1440"/>
-          </w:tcPr>
-          <w:p>
-            <w:r>
-              <w:t>0.082</w:t>
-            </w:r>
-          </w:p>
-        </w:tc>
-        <w:tc>
-          <w:tcPr>
-            <w:tcW w:type="dxa" w:w="1440"/>
-          </w:tcPr>
-          <w:p>
-            <w:r>
-              <w:t>0.003</w:t>
-            </w:r>
-          </w:p>
-        </w:tc>
-        <w:tc>
-          <w:tcPr>
-            <w:tcW w:type="dxa" w:w="1440"/>
-          </w:tcPr>
-          <w:p>
-            <w:r>
-              <w:t>0.026</w:t>
-            </w:r>
-          </w:p>
-        </w:tc>
-        <w:tc>
-          <w:tcPr>
-            <w:tcW w:type="dxa" w:w="1440"/>
-          </w:tcPr>
-          <w:p>
-            <w:r>
-              <w:t>0.025</w:t>
+              <w:t>2016</w:t>
+            </w:r>
+          </w:p>
+        </w:tc>
+        <w:tc>
+          <w:tcPr>
+            <w:tcW w:type="dxa" w:w="1440"/>
+          </w:tcPr>
+          <w:p>
+            <w:r>
+              <w:t>0.080</w:t>
+            </w:r>
+          </w:p>
+        </w:tc>
+        <w:tc>
+          <w:tcPr>
+            <w:tcW w:type="dxa" w:w="1440"/>
+          </w:tcPr>
+          <w:p>
+            <w:r>
+              <w:t>0.010</w:t>
+            </w:r>
+          </w:p>
+        </w:tc>
+        <w:tc>
+          <w:tcPr>
+            <w:tcW w:type="dxa" w:w="1440"/>
+          </w:tcPr>
+          <w:p>
+            <w:r>
+              <w:t>0.036</w:t>
+            </w:r>
+          </w:p>
+        </w:tc>
+        <w:tc>
+          <w:tcPr>
+            <w:tcW w:type="dxa" w:w="1440"/>
+          </w:tcPr>
+          <w:p>
+            <w:r>
+              <w:t>0.010</w:t>
             </w:r>
           </w:p>
         </w:tc>
@@ -2649,66 +2714,6 @@
           </w:tcPr>
           <w:p>
             <w:r>
-              <w:t>2016</w:t>
-            </w:r>
-          </w:p>
-        </w:tc>
-        <w:tc>
-          <w:tcPr>
-            <w:tcW w:type="dxa" w:w="1440"/>
-          </w:tcPr>
-          <w:p>
-            <w:r>
-              <w:t>0.091</w:t>
-            </w:r>
-          </w:p>
-        </w:tc>
-        <w:tc>
-          <w:tcPr>
-            <w:tcW w:type="dxa" w:w="1440"/>
-          </w:tcPr>
-          <w:p>
-            <w:r>
-              <w:t>0.015</w:t>
-            </w:r>
-          </w:p>
-        </w:tc>
-        <w:tc>
-          <w:tcPr>
-            <w:tcW w:type="dxa" w:w="1440"/>
-          </w:tcPr>
-          <w:p>
-            <w:r>
-              <w:t>0.042</w:t>
-            </w:r>
-          </w:p>
-        </w:tc>
-        <w:tc>
-          <w:tcPr>
-            <w:tcW w:type="dxa" w:w="1440"/>
-          </w:tcPr>
-          <w:p>
-            <w:r>
-              <w:t>0.014</w:t>
-            </w:r>
-          </w:p>
-        </w:tc>
-      </w:tr>
-      <w:tr>
-        <w:tc>
-          <w:tcPr>
-            <w:tcW w:type="dxa" w:w="1440"/>
-          </w:tcPr>
-          <w:p>
-            <w:r/>
-          </w:p>
-        </w:tc>
-        <w:tc>
-          <w:tcPr>
-            <w:tcW w:type="dxa" w:w="1440"/>
-          </w:tcPr>
-          <w:p>
-            <w:r>
               <w:t>2019</w:t>
             </w:r>
           </w:p>
@@ -2719,17 +2724,17 @@
           </w:tcPr>
           <w:p>
             <w:r>
-              <w:t>0.075</w:t>
-            </w:r>
-          </w:p>
-        </w:tc>
-        <w:tc>
-          <w:tcPr>
-            <w:tcW w:type="dxa" w:w="1440"/>
-          </w:tcPr>
-          <w:p>
-            <w:r>
-              <w:t>0.013</w:t>
+              <w:t>0.074</w:t>
+            </w:r>
+          </w:p>
+        </w:tc>
+        <w:tc>
+          <w:tcPr>
+            <w:tcW w:type="dxa" w:w="1440"/>
+          </w:tcPr>
+          <w:p>
+            <w:r>
+              <w:t>0.006</w:t>
             </w:r>
           </w:p>
         </w:tc>
@@ -2764,7 +2769,7 @@
               <w:rPr>
                 <w:b/>
               </w:rPr>
-              <w:t>Mali</w:t>
+              <w:t>Mali (LSMS)</w:t>
             </w:r>
           </w:p>
         </w:tc>
@@ -2889,7 +2894,7 @@
               <w:rPr>
                 <w:b/>
               </w:rPr>
-              <w:t>Niger</w:t>
+              <w:t>Niger (LSMS)</w:t>
             </w:r>
           </w:p>
         </w:tc>
@@ -3014,7 +3019,7 @@
               <w:rPr>
                 <w:b/>
               </w:rPr>
-              <w:t>Nigeria</w:t>
+              <w:t>Nigeria (LSMS)</w:t>
             </w:r>
           </w:p>
         </w:tc>
@@ -3319,7 +3324,7 @@
               <w:rPr>
                 <w:b/>
               </w:rPr>
-              <w:t>Tanzania</w:t>
+              <w:t>Tanzania (LSMS)</w:t>
             </w:r>
           </w:p>
         </w:tc>
@@ -3624,7 +3629,7 @@
               <w:rPr>
                 <w:b/>
               </w:rPr>
-              <w:t>Uganda</w:t>
+              <w:t>Uganda (LSMS)</w:t>
             </w:r>
           </w:p>
         </w:tc>
@@ -4049,7 +4054,7 @@
               <w:rPr>
                 <w:b/>
               </w:rPr>
-              <w:t>Zambia</w:t>
+              <w:t>Zambia (RALS)</w:t>
             </w:r>
           </w:p>
         </w:tc>
@@ -4319,7 +4324,7 @@
               <w:rPr>
                 <w:b/>
               </w:rPr>
-              <w:t>Ethiopia</w:t>
+              <w:t>Ethiopia (LSMS)</w:t>
             </w:r>
           </w:p>
         </w:tc>
@@ -4624,7 +4629,7 @@
               <w:rPr>
                 <w:b/>
               </w:rPr>
-              <w:t>Malawi</w:t>
+              <w:t>Malawi (LSMS)</w:t>
             </w:r>
           </w:p>
         </w:tc>
@@ -4644,17 +4649,17 @@
           </w:tcPr>
           <w:p>
             <w:r>
-              <w:t>0.077</w:t>
-            </w:r>
-          </w:p>
-        </w:tc>
-        <w:tc>
-          <w:tcPr>
-            <w:tcW w:type="dxa" w:w="1440"/>
-          </w:tcPr>
-          <w:p>
-            <w:r>
-              <w:t>0.002</w:t>
+              <w:t>0.072</w:t>
+            </w:r>
+          </w:p>
+        </w:tc>
+        <w:tc>
+          <w:tcPr>
+            <w:tcW w:type="dxa" w:w="1440"/>
+          </w:tcPr>
+          <w:p>
+            <w:r>
+              <w:t>0.001</w:t>
             </w:r>
           </w:p>
         </w:tc>
@@ -4694,47 +4699,47 @@
           </w:tcPr>
           <w:p>
             <w:r>
-              <w:t>2013</w:t>
-            </w:r>
-          </w:p>
-        </w:tc>
-        <w:tc>
-          <w:tcPr>
-            <w:tcW w:type="dxa" w:w="1440"/>
-          </w:tcPr>
-          <w:p>
-            <w:r>
-              <w:t>0.102</w:t>
-            </w:r>
-          </w:p>
-        </w:tc>
-        <w:tc>
-          <w:tcPr>
-            <w:tcW w:type="dxa" w:w="1440"/>
-          </w:tcPr>
-          <w:p>
-            <w:r>
-              <w:t>0.004</w:t>
-            </w:r>
-          </w:p>
-        </w:tc>
-        <w:tc>
-          <w:tcPr>
-            <w:tcW w:type="dxa" w:w="1440"/>
-          </w:tcPr>
-          <w:p>
-            <w:r>
-              <w:t>0.039</w:t>
-            </w:r>
-          </w:p>
-        </w:tc>
-        <w:tc>
-          <w:tcPr>
-            <w:tcW w:type="dxa" w:w="1440"/>
-          </w:tcPr>
-          <w:p>
-            <w:r>
-              <w:t>0.026</w:t>
+              <w:t>2016</w:t>
+            </w:r>
+          </w:p>
+        </w:tc>
+        <w:tc>
+          <w:tcPr>
+            <w:tcW w:type="dxa" w:w="1440"/>
+          </w:tcPr>
+          <w:p>
+            <w:r>
+              <w:t>0.077</w:t>
+            </w:r>
+          </w:p>
+        </w:tc>
+        <w:tc>
+          <w:tcPr>
+            <w:tcW w:type="dxa" w:w="1440"/>
+          </w:tcPr>
+          <w:p>
+            <w:r>
+              <w:t>0.010</w:t>
+            </w:r>
+          </w:p>
+        </w:tc>
+        <w:tc>
+          <w:tcPr>
+            <w:tcW w:type="dxa" w:w="1440"/>
+          </w:tcPr>
+          <w:p>
+            <w:r>
+              <w:t>0.048</w:t>
+            </w:r>
+          </w:p>
+        </w:tc>
+        <w:tc>
+          <w:tcPr>
+            <w:tcW w:type="dxa" w:w="1440"/>
+          </w:tcPr>
+          <w:p>
+            <w:r>
+              <w:t>0.022</w:t>
             </w:r>
           </w:p>
         </w:tc>
@@ -4754,66 +4759,6 @@
           </w:tcPr>
           <w:p>
             <w:r>
-              <w:t>2016</w:t>
-            </w:r>
-          </w:p>
-        </w:tc>
-        <w:tc>
-          <w:tcPr>
-            <w:tcW w:type="dxa" w:w="1440"/>
-          </w:tcPr>
-          <w:p>
-            <w:r>
-              <w:t>0.077</w:t>
-            </w:r>
-          </w:p>
-        </w:tc>
-        <w:tc>
-          <w:tcPr>
-            <w:tcW w:type="dxa" w:w="1440"/>
-          </w:tcPr>
-          <w:p>
-            <w:r>
-              <w:t>0.014</w:t>
-            </w:r>
-          </w:p>
-        </w:tc>
-        <w:tc>
-          <w:tcPr>
-            <w:tcW w:type="dxa" w:w="1440"/>
-          </w:tcPr>
-          <w:p>
-            <w:r>
-              <w:t>0.059</w:t>
-            </w:r>
-          </w:p>
-        </w:tc>
-        <w:tc>
-          <w:tcPr>
-            <w:tcW w:type="dxa" w:w="1440"/>
-          </w:tcPr>
-          <w:p>
-            <w:r>
-              <w:t>0.014</w:t>
-            </w:r>
-          </w:p>
-        </w:tc>
-      </w:tr>
-      <w:tr>
-        <w:tc>
-          <w:tcPr>
-            <w:tcW w:type="dxa" w:w="1440"/>
-          </w:tcPr>
-          <w:p>
-            <w:r/>
-          </w:p>
-        </w:tc>
-        <w:tc>
-          <w:tcPr>
-            <w:tcW w:type="dxa" w:w="1440"/>
-          </w:tcPr>
-          <w:p>
-            <w:r>
               <w:t>2019</w:t>
             </w:r>
           </w:p>
@@ -4824,17 +4769,17 @@
           </w:tcPr>
           <w:p>
             <w:r>
-              <w:t>0.051</w:t>
-            </w:r>
-          </w:p>
-        </w:tc>
-        <w:tc>
-          <w:tcPr>
-            <w:tcW w:type="dxa" w:w="1440"/>
-          </w:tcPr>
-          <w:p>
-            <w:r>
-              <w:t>0.013</w:t>
+              <w:t>0.073</w:t>
+            </w:r>
+          </w:p>
+        </w:tc>
+        <w:tc>
+          <w:tcPr>
+            <w:tcW w:type="dxa" w:w="1440"/>
+          </w:tcPr>
+          <w:p>
+            <w:r>
+              <w:t>0.005</w:t>
             </w:r>
           </w:p>
         </w:tc>
@@ -4869,7 +4814,7 @@
               <w:rPr>
                 <w:b/>
               </w:rPr>
-              <w:t>Mali</w:t>
+              <w:t>Mali (LSMS)</w:t>
             </w:r>
           </w:p>
         </w:tc>
@@ -4994,7 +4939,7 @@
               <w:rPr>
                 <w:b/>
               </w:rPr>
-              <w:t>Niger</w:t>
+              <w:t>Niger (LSMS)</w:t>
             </w:r>
           </w:p>
         </w:tc>
@@ -5119,7 +5064,7 @@
               <w:rPr>
                 <w:b/>
               </w:rPr>
-              <w:t>Nigeria</w:t>
+              <w:t>Nigeria (LSMS)</w:t>
             </w:r>
           </w:p>
         </w:tc>
@@ -5424,7 +5369,7 @@
               <w:rPr>
                 <w:b/>
               </w:rPr>
-              <w:t>Tanzania</w:t>
+              <w:t>Tanzania (LSMS)</w:t>
             </w:r>
           </w:p>
         </w:tc>
@@ -5729,7 +5674,7 @@
               <w:rPr>
                 <w:b/>
               </w:rPr>
-              <w:t>Uganda</w:t>
+              <w:t>Tanzania (ASC)</w:t>
             </w:r>
           </w:p>
         </w:tc>
@@ -5749,37 +5694,37 @@
           </w:tcPr>
           <w:p>
             <w:r>
-              <w:t>0.062</w:t>
-            </w:r>
-          </w:p>
-        </w:tc>
-        <w:tc>
-          <w:tcPr>
-            <w:tcW w:type="dxa" w:w="1440"/>
-          </w:tcPr>
-          <w:p>
-            <w:r>
-              <w:t>0.022</w:t>
-            </w:r>
-          </w:p>
-        </w:tc>
-        <w:tc>
-          <w:tcPr>
-            <w:tcW w:type="dxa" w:w="1440"/>
-          </w:tcPr>
-          <w:p>
-            <w:r>
-              <w:t>0.259</w:t>
-            </w:r>
-          </w:p>
-        </w:tc>
-        <w:tc>
-          <w:tcPr>
-            <w:tcW w:type="dxa" w:w="1440"/>
-          </w:tcPr>
-          <w:p>
-            <w:r>
-              <w:t>0.242</w:t>
+              <w:t>0.045</w:t>
+            </w:r>
+          </w:p>
+        </w:tc>
+        <w:tc>
+          <w:tcPr>
+            <w:tcW w:type="dxa" w:w="1440"/>
+          </w:tcPr>
+          <w:p>
+            <w:r>
+              <w:t>0.016</w:t>
+            </w:r>
+          </w:p>
+        </w:tc>
+        <w:tc>
+          <w:tcPr>
+            <w:tcW w:type="dxa" w:w="1440"/>
+          </w:tcPr>
+          <w:p>
+            <w:r>
+              <w:t>0.156</w:t>
+            </w:r>
+          </w:p>
+        </w:tc>
+        <w:tc>
+          <w:tcPr>
+            <w:tcW w:type="dxa" w:w="1440"/>
+          </w:tcPr>
+          <w:p>
+            <w:r>
+              <w:t>0.055</w:t>
             </w:r>
           </w:p>
         </w:tc>
@@ -5799,306 +5744,6 @@
           </w:tcPr>
           <w:p>
             <w:r>
-              <w:t>2010</w:t>
-            </w:r>
-          </w:p>
-        </w:tc>
-        <w:tc>
-          <w:tcPr>
-            <w:tcW w:type="dxa" w:w="1440"/>
-          </w:tcPr>
-          <w:p>
-            <w:r>
-              <w:t>0.066</w:t>
-            </w:r>
-          </w:p>
-        </w:tc>
-        <w:tc>
-          <w:tcPr>
-            <w:tcW w:type="dxa" w:w="1440"/>
-          </w:tcPr>
-          <w:p>
-            <w:r>
-              <w:t>0.004</w:t>
-            </w:r>
-          </w:p>
-        </w:tc>
-        <w:tc>
-          <w:tcPr>
-            <w:tcW w:type="dxa" w:w="1440"/>
-          </w:tcPr>
-          <w:p>
-            <w:r>
-              <w:t>0.237</w:t>
-            </w:r>
-          </w:p>
-        </w:tc>
-        <w:tc>
-          <w:tcPr>
-            <w:tcW w:type="dxa" w:w="1440"/>
-          </w:tcPr>
-          <w:p>
-            <w:r>
-              <w:t>0.162</w:t>
-            </w:r>
-          </w:p>
-        </w:tc>
-      </w:tr>
-      <w:tr>
-        <w:tc>
-          <w:tcPr>
-            <w:tcW w:type="dxa" w:w="1440"/>
-          </w:tcPr>
-          <w:p>
-            <w:r/>
-          </w:p>
-        </w:tc>
-        <w:tc>
-          <w:tcPr>
-            <w:tcW w:type="dxa" w:w="1440"/>
-          </w:tcPr>
-          <w:p>
-            <w:r>
-              <w:t>2011</w:t>
-            </w:r>
-          </w:p>
-        </w:tc>
-        <w:tc>
-          <w:tcPr>
-            <w:tcW w:type="dxa" w:w="1440"/>
-          </w:tcPr>
-          <w:p>
-            <w:r>
-              <w:t>0.048</w:t>
-            </w:r>
-          </w:p>
-        </w:tc>
-        <w:tc>
-          <w:tcPr>
-            <w:tcW w:type="dxa" w:w="1440"/>
-          </w:tcPr>
-          <w:p>
-            <w:r>
-              <w:t>0.017</w:t>
-            </w:r>
-          </w:p>
-        </w:tc>
-        <w:tc>
-          <w:tcPr>
-            <w:tcW w:type="dxa" w:w="1440"/>
-          </w:tcPr>
-          <w:p>
-            <w:r>
-              <w:t>0.246</w:t>
-            </w:r>
-          </w:p>
-        </w:tc>
-        <w:tc>
-          <w:tcPr>
-            <w:tcW w:type="dxa" w:w="1440"/>
-          </w:tcPr>
-          <w:p>
-            <w:r>
-              <w:t>0.152</w:t>
-            </w:r>
-          </w:p>
-        </w:tc>
-      </w:tr>
-      <w:tr>
-        <w:tc>
-          <w:tcPr>
-            <w:tcW w:type="dxa" w:w="1440"/>
-          </w:tcPr>
-          <w:p>
-            <w:r/>
-          </w:p>
-        </w:tc>
-        <w:tc>
-          <w:tcPr>
-            <w:tcW w:type="dxa" w:w="1440"/>
-          </w:tcPr>
-          <w:p>
-            <w:r>
-              <w:t>2013</w:t>
-            </w:r>
-          </w:p>
-        </w:tc>
-        <w:tc>
-          <w:tcPr>
-            <w:tcW w:type="dxa" w:w="1440"/>
-          </w:tcPr>
-          <w:p>
-            <w:r>
-              <w:t>0.075</w:t>
-            </w:r>
-          </w:p>
-        </w:tc>
-        <w:tc>
-          <w:tcPr>
-            <w:tcW w:type="dxa" w:w="1440"/>
-          </w:tcPr>
-          <w:p>
-            <w:r>
-              <w:t>0.008</w:t>
-            </w:r>
-          </w:p>
-        </w:tc>
-        <w:tc>
-          <w:tcPr>
-            <w:tcW w:type="dxa" w:w="1440"/>
-          </w:tcPr>
-          <w:p>
-            <w:r>
-              <w:t>0.286</w:t>
-            </w:r>
-          </w:p>
-        </w:tc>
-        <w:tc>
-          <w:tcPr>
-            <w:tcW w:type="dxa" w:w="1440"/>
-          </w:tcPr>
-          <w:p>
-            <w:r>
-              <w:t>0.239</w:t>
-            </w:r>
-          </w:p>
-        </w:tc>
-      </w:tr>
-      <w:tr>
-        <w:tc>
-          <w:tcPr>
-            <w:tcW w:type="dxa" w:w="1440"/>
-          </w:tcPr>
-          <w:p>
-            <w:r/>
-          </w:p>
-        </w:tc>
-        <w:tc>
-          <w:tcPr>
-            <w:tcW w:type="dxa" w:w="1440"/>
-          </w:tcPr>
-          <w:p>
-            <w:r>
-              <w:t>2015</w:t>
-            </w:r>
-          </w:p>
-        </w:tc>
-        <w:tc>
-          <w:tcPr>
-            <w:tcW w:type="dxa" w:w="1440"/>
-          </w:tcPr>
-          <w:p>
-            <w:r>
-              <w:t>0.094</w:t>
-            </w:r>
-          </w:p>
-        </w:tc>
-        <w:tc>
-          <w:tcPr>
-            <w:tcW w:type="dxa" w:w="1440"/>
-          </w:tcPr>
-          <w:p>
-            <w:r>
-              <w:t>0.008</w:t>
-            </w:r>
-          </w:p>
-        </w:tc>
-        <w:tc>
-          <w:tcPr>
-            <w:tcW w:type="dxa" w:w="1440"/>
-          </w:tcPr>
-          <w:p>
-            <w:r>
-              <w:t>0.296</w:t>
-            </w:r>
-          </w:p>
-        </w:tc>
-        <w:tc>
-          <w:tcPr>
-            <w:tcW w:type="dxa" w:w="1440"/>
-          </w:tcPr>
-          <w:p>
-            <w:r>
-              <w:t>0.224</w:t>
-            </w:r>
-          </w:p>
-        </w:tc>
-      </w:tr>
-      <w:tr>
-        <w:tc>
-          <w:tcPr>
-            <w:tcW w:type="dxa" w:w="1440"/>
-          </w:tcPr>
-          <w:p>
-            <w:r/>
-          </w:p>
-        </w:tc>
-        <w:tc>
-          <w:tcPr>
-            <w:tcW w:type="dxa" w:w="1440"/>
-          </w:tcPr>
-          <w:p>
-            <w:r>
-              <w:t>2018</w:t>
-            </w:r>
-          </w:p>
-        </w:tc>
-        <w:tc>
-          <w:tcPr>
-            <w:tcW w:type="dxa" w:w="1440"/>
-          </w:tcPr>
-          <w:p>
-            <w:r>
-              <w:t>0.134</w:t>
-            </w:r>
-          </w:p>
-        </w:tc>
-        <w:tc>
-          <w:tcPr>
-            <w:tcW w:type="dxa" w:w="1440"/>
-          </w:tcPr>
-          <w:p>
-            <w:r>
-              <w:t>0.003</w:t>
-            </w:r>
-          </w:p>
-        </w:tc>
-        <w:tc>
-          <w:tcPr>
-            <w:tcW w:type="dxa" w:w="1440"/>
-          </w:tcPr>
-          <w:p>
-            <w:r>
-              <w:t>-</w:t>
-            </w:r>
-          </w:p>
-        </w:tc>
-        <w:tc>
-          <w:tcPr>
-            <w:tcW w:type="dxa" w:w="1440"/>
-          </w:tcPr>
-          <w:p>
-            <w:r>
-              <w:t>0.125</w:t>
-            </w:r>
-          </w:p>
-        </w:tc>
-      </w:tr>
-      <w:tr>
-        <w:tc>
-          <w:tcPr>
-            <w:tcW w:type="dxa" w:w="1440"/>
-          </w:tcPr>
-          <w:p>
-            <w:r/>
-          </w:p>
-        </w:tc>
-        <w:tc>
-          <w:tcPr>
-            <w:tcW w:type="dxa" w:w="1440"/>
-          </w:tcPr>
-          <w:p>
-            <w:r>
               <w:t>2019</w:t>
             </w:r>
           </w:p>
@@ -6109,37 +5754,37 @@
           </w:tcPr>
           <w:p>
             <w:r>
-              <w:t>0.082</w:t>
-            </w:r>
-          </w:p>
-        </w:tc>
-        <w:tc>
-          <w:tcPr>
-            <w:tcW w:type="dxa" w:w="1440"/>
-          </w:tcPr>
-          <w:p>
-            <w:r>
-              <w:t>0.011</w:t>
-            </w:r>
-          </w:p>
-        </w:tc>
-        <w:tc>
-          <w:tcPr>
-            <w:tcW w:type="dxa" w:w="1440"/>
-          </w:tcPr>
-          <w:p>
-            <w:r>
-              <w:t>0.272</w:t>
-            </w:r>
-          </w:p>
-        </w:tc>
-        <w:tc>
-          <w:tcPr>
-            <w:tcW w:type="dxa" w:w="1440"/>
-          </w:tcPr>
-          <w:p>
-            <w:r>
-              <w:t>0.046</w:t>
+              <w:t>0.085</w:t>
+            </w:r>
+          </w:p>
+        </w:tc>
+        <w:tc>
+          <w:tcPr>
+            <w:tcW w:type="dxa" w:w="1440"/>
+          </w:tcPr>
+          <w:p>
+            <w:r>
+              <w:t>0.020</w:t>
+            </w:r>
+          </w:p>
+        </w:tc>
+        <w:tc>
+          <w:tcPr>
+            <w:tcW w:type="dxa" w:w="1440"/>
+          </w:tcPr>
+          <w:p>
+            <w:r>
+              <w:t>0.060</w:t>
+            </w:r>
+          </w:p>
+        </w:tc>
+        <w:tc>
+          <w:tcPr>
+            <w:tcW w:type="dxa" w:w="1440"/>
+          </w:tcPr>
+          <w:p>
+            <w:r>
+              <w:t>0.059</w:t>
             </w:r>
           </w:p>
         </w:tc>
@@ -6154,7 +5799,432 @@
               <w:rPr>
                 <w:b/>
               </w:rPr>
-              <w:t>Zambia</w:t>
+              <w:t>Uganda (LSMS)</w:t>
+            </w:r>
+          </w:p>
+        </w:tc>
+        <w:tc>
+          <w:tcPr>
+            <w:tcW w:type="dxa" w:w="1440"/>
+          </w:tcPr>
+          <w:p>
+            <w:r>
+              <w:t>2009</w:t>
+            </w:r>
+          </w:p>
+        </w:tc>
+        <w:tc>
+          <w:tcPr>
+            <w:tcW w:type="dxa" w:w="1440"/>
+          </w:tcPr>
+          <w:p>
+            <w:r>
+              <w:t>0.062</w:t>
+            </w:r>
+          </w:p>
+        </w:tc>
+        <w:tc>
+          <w:tcPr>
+            <w:tcW w:type="dxa" w:w="1440"/>
+          </w:tcPr>
+          <w:p>
+            <w:r>
+              <w:t>0.022</w:t>
+            </w:r>
+          </w:p>
+        </w:tc>
+        <w:tc>
+          <w:tcPr>
+            <w:tcW w:type="dxa" w:w="1440"/>
+          </w:tcPr>
+          <w:p>
+            <w:r>
+              <w:t>0.259</w:t>
+            </w:r>
+          </w:p>
+        </w:tc>
+        <w:tc>
+          <w:tcPr>
+            <w:tcW w:type="dxa" w:w="1440"/>
+          </w:tcPr>
+          <w:p>
+            <w:r>
+              <w:t>0.242</w:t>
+            </w:r>
+          </w:p>
+        </w:tc>
+      </w:tr>
+      <w:tr>
+        <w:tc>
+          <w:tcPr>
+            <w:tcW w:type="dxa" w:w="1440"/>
+          </w:tcPr>
+          <w:p>
+            <w:r/>
+          </w:p>
+        </w:tc>
+        <w:tc>
+          <w:tcPr>
+            <w:tcW w:type="dxa" w:w="1440"/>
+          </w:tcPr>
+          <w:p>
+            <w:r>
+              <w:t>2010</w:t>
+            </w:r>
+          </w:p>
+        </w:tc>
+        <w:tc>
+          <w:tcPr>
+            <w:tcW w:type="dxa" w:w="1440"/>
+          </w:tcPr>
+          <w:p>
+            <w:r>
+              <w:t>0.066</w:t>
+            </w:r>
+          </w:p>
+        </w:tc>
+        <w:tc>
+          <w:tcPr>
+            <w:tcW w:type="dxa" w:w="1440"/>
+          </w:tcPr>
+          <w:p>
+            <w:r>
+              <w:t>0.004</w:t>
+            </w:r>
+          </w:p>
+        </w:tc>
+        <w:tc>
+          <w:tcPr>
+            <w:tcW w:type="dxa" w:w="1440"/>
+          </w:tcPr>
+          <w:p>
+            <w:r>
+              <w:t>0.237</w:t>
+            </w:r>
+          </w:p>
+        </w:tc>
+        <w:tc>
+          <w:tcPr>
+            <w:tcW w:type="dxa" w:w="1440"/>
+          </w:tcPr>
+          <w:p>
+            <w:r>
+              <w:t>0.162</w:t>
+            </w:r>
+          </w:p>
+        </w:tc>
+      </w:tr>
+      <w:tr>
+        <w:tc>
+          <w:tcPr>
+            <w:tcW w:type="dxa" w:w="1440"/>
+          </w:tcPr>
+          <w:p>
+            <w:r/>
+          </w:p>
+        </w:tc>
+        <w:tc>
+          <w:tcPr>
+            <w:tcW w:type="dxa" w:w="1440"/>
+          </w:tcPr>
+          <w:p>
+            <w:r>
+              <w:t>2011</w:t>
+            </w:r>
+          </w:p>
+        </w:tc>
+        <w:tc>
+          <w:tcPr>
+            <w:tcW w:type="dxa" w:w="1440"/>
+          </w:tcPr>
+          <w:p>
+            <w:r>
+              <w:t>0.048</w:t>
+            </w:r>
+          </w:p>
+        </w:tc>
+        <w:tc>
+          <w:tcPr>
+            <w:tcW w:type="dxa" w:w="1440"/>
+          </w:tcPr>
+          <w:p>
+            <w:r>
+              <w:t>0.017</w:t>
+            </w:r>
+          </w:p>
+        </w:tc>
+        <w:tc>
+          <w:tcPr>
+            <w:tcW w:type="dxa" w:w="1440"/>
+          </w:tcPr>
+          <w:p>
+            <w:r>
+              <w:t>0.246</w:t>
+            </w:r>
+          </w:p>
+        </w:tc>
+        <w:tc>
+          <w:tcPr>
+            <w:tcW w:type="dxa" w:w="1440"/>
+          </w:tcPr>
+          <w:p>
+            <w:r>
+              <w:t>0.152</w:t>
+            </w:r>
+          </w:p>
+        </w:tc>
+      </w:tr>
+      <w:tr>
+        <w:tc>
+          <w:tcPr>
+            <w:tcW w:type="dxa" w:w="1440"/>
+          </w:tcPr>
+          <w:p>
+            <w:r/>
+          </w:p>
+        </w:tc>
+        <w:tc>
+          <w:tcPr>
+            <w:tcW w:type="dxa" w:w="1440"/>
+          </w:tcPr>
+          <w:p>
+            <w:r>
+              <w:t>2013</w:t>
+            </w:r>
+          </w:p>
+        </w:tc>
+        <w:tc>
+          <w:tcPr>
+            <w:tcW w:type="dxa" w:w="1440"/>
+          </w:tcPr>
+          <w:p>
+            <w:r>
+              <w:t>0.075</w:t>
+            </w:r>
+          </w:p>
+        </w:tc>
+        <w:tc>
+          <w:tcPr>
+            <w:tcW w:type="dxa" w:w="1440"/>
+          </w:tcPr>
+          <w:p>
+            <w:r>
+              <w:t>0.008</w:t>
+            </w:r>
+          </w:p>
+        </w:tc>
+        <w:tc>
+          <w:tcPr>
+            <w:tcW w:type="dxa" w:w="1440"/>
+          </w:tcPr>
+          <w:p>
+            <w:r>
+              <w:t>0.286</w:t>
+            </w:r>
+          </w:p>
+        </w:tc>
+        <w:tc>
+          <w:tcPr>
+            <w:tcW w:type="dxa" w:w="1440"/>
+          </w:tcPr>
+          <w:p>
+            <w:r>
+              <w:t>0.239</w:t>
+            </w:r>
+          </w:p>
+        </w:tc>
+      </w:tr>
+      <w:tr>
+        <w:tc>
+          <w:tcPr>
+            <w:tcW w:type="dxa" w:w="1440"/>
+          </w:tcPr>
+          <w:p>
+            <w:r/>
+          </w:p>
+        </w:tc>
+        <w:tc>
+          <w:tcPr>
+            <w:tcW w:type="dxa" w:w="1440"/>
+          </w:tcPr>
+          <w:p>
+            <w:r>
+              <w:t>2015</w:t>
+            </w:r>
+          </w:p>
+        </w:tc>
+        <w:tc>
+          <w:tcPr>
+            <w:tcW w:type="dxa" w:w="1440"/>
+          </w:tcPr>
+          <w:p>
+            <w:r>
+              <w:t>0.094</w:t>
+            </w:r>
+          </w:p>
+        </w:tc>
+        <w:tc>
+          <w:tcPr>
+            <w:tcW w:type="dxa" w:w="1440"/>
+          </w:tcPr>
+          <w:p>
+            <w:r>
+              <w:t>0.008</w:t>
+            </w:r>
+          </w:p>
+        </w:tc>
+        <w:tc>
+          <w:tcPr>
+            <w:tcW w:type="dxa" w:w="1440"/>
+          </w:tcPr>
+          <w:p>
+            <w:r>
+              <w:t>0.296</w:t>
+            </w:r>
+          </w:p>
+        </w:tc>
+        <w:tc>
+          <w:tcPr>
+            <w:tcW w:type="dxa" w:w="1440"/>
+          </w:tcPr>
+          <w:p>
+            <w:r>
+              <w:t>0.224</w:t>
+            </w:r>
+          </w:p>
+        </w:tc>
+      </w:tr>
+      <w:tr>
+        <w:tc>
+          <w:tcPr>
+            <w:tcW w:type="dxa" w:w="1440"/>
+          </w:tcPr>
+          <w:p>
+            <w:r/>
+          </w:p>
+        </w:tc>
+        <w:tc>
+          <w:tcPr>
+            <w:tcW w:type="dxa" w:w="1440"/>
+          </w:tcPr>
+          <w:p>
+            <w:r>
+              <w:t>2018</w:t>
+            </w:r>
+          </w:p>
+        </w:tc>
+        <w:tc>
+          <w:tcPr>
+            <w:tcW w:type="dxa" w:w="1440"/>
+          </w:tcPr>
+          <w:p>
+            <w:r>
+              <w:t>0.134</w:t>
+            </w:r>
+          </w:p>
+        </w:tc>
+        <w:tc>
+          <w:tcPr>
+            <w:tcW w:type="dxa" w:w="1440"/>
+          </w:tcPr>
+          <w:p>
+            <w:r>
+              <w:t>0.003</w:t>
+            </w:r>
+          </w:p>
+        </w:tc>
+        <w:tc>
+          <w:tcPr>
+            <w:tcW w:type="dxa" w:w="1440"/>
+          </w:tcPr>
+          <w:p>
+            <w:r>
+              <w:t>-</w:t>
+            </w:r>
+          </w:p>
+        </w:tc>
+        <w:tc>
+          <w:tcPr>
+            <w:tcW w:type="dxa" w:w="1440"/>
+          </w:tcPr>
+          <w:p>
+            <w:r>
+              <w:t>0.125</w:t>
+            </w:r>
+          </w:p>
+        </w:tc>
+      </w:tr>
+      <w:tr>
+        <w:tc>
+          <w:tcPr>
+            <w:tcW w:type="dxa" w:w="1440"/>
+          </w:tcPr>
+          <w:p>
+            <w:r/>
+          </w:p>
+        </w:tc>
+        <w:tc>
+          <w:tcPr>
+            <w:tcW w:type="dxa" w:w="1440"/>
+          </w:tcPr>
+          <w:p>
+            <w:r>
+              <w:t>2019</w:t>
+            </w:r>
+          </w:p>
+        </w:tc>
+        <w:tc>
+          <w:tcPr>
+            <w:tcW w:type="dxa" w:w="1440"/>
+          </w:tcPr>
+          <w:p>
+            <w:r>
+              <w:t>0.082</w:t>
+            </w:r>
+          </w:p>
+        </w:tc>
+        <w:tc>
+          <w:tcPr>
+            <w:tcW w:type="dxa" w:w="1440"/>
+          </w:tcPr>
+          <w:p>
+            <w:r>
+              <w:t>0.011</w:t>
+            </w:r>
+          </w:p>
+        </w:tc>
+        <w:tc>
+          <w:tcPr>
+            <w:tcW w:type="dxa" w:w="1440"/>
+          </w:tcPr>
+          <w:p>
+            <w:r>
+              <w:t>0.272</w:t>
+            </w:r>
+          </w:p>
+        </w:tc>
+        <w:tc>
+          <w:tcPr>
+            <w:tcW w:type="dxa" w:w="1440"/>
+          </w:tcPr>
+          <w:p>
+            <w:r>
+              <w:t>0.046</w:t>
+            </w:r>
+          </w:p>
+        </w:tc>
+      </w:tr>
+      <w:tr>
+        <w:tc>
+          <w:tcPr>
+            <w:tcW w:type="dxa" w:w="1440"/>
+          </w:tcPr>
+          <w:p>
+            <w:r>
+              <w:rPr>
+                <w:b/>
+              </w:rPr>
+              <w:t>Zambia (RALS)</w:t>
             </w:r>
           </w:p>
         </w:tc>

</xml_diff>